<commit_message>
docs(report): add scoring-method breakdown to model comparison
Add a small follow-up clarification to the April 2026 accuracy reports showing that benchmark success is driven mainly by numeric and exact grounding rather than by fuzzy matching.

Include recorded scoring-method counts for the GPT-5.4-mini and Mistral Small 3.1 comparison runs, update the stakeholder report text, and regenerate the DOCX/PDF exports.
</commit_message>
<xml_diff>
--- a/docs/reports/2026-04-statschat-ke-testing-accuracy-report.docx
+++ b/docs/reports/2026-04-statschat-ke-testing-accuracy-report.docx
@@ -2173,6 +2173,14 @@
     </w:p>
     <w:p>
       <w:pPr>
+        <w:spacing w:after="120"/>
+      </w:pPr>
+      <w:r>
+        <w:t>The recorded scoring methods show that fuzzy matching is not dominating the benchmark. On the best GPT run, 52 correct answerable rows were recorded as numeric_match and only 5 as text_match. On the clean Mistral comparison run, 40 correct answerable rows were recorded as numeric_match, 7 as exact_match, and 3 as text_match. This means the benchmark is mostly being won through correct numeric or exact grounding rather than through permissive fuzzy matching.</w:t>
+      </w:r>
+    </w:p>
+    <w:p>
+      <w:pPr>
         <w:pStyle w:val="Heading1"/>
       </w:pPr>
       <w:r>

</xml_diff>

<commit_message>
docs(reports): add author attribution to exported reports
Add Damian Ejlli as the report author in both markdown sources and regenerate the DOCX/PDF exports so the visible report text and document metadata stay aligned.
</commit_message>
<xml_diff>
--- a/docs/reports/2026-04-statschat-ke-testing-accuracy-report.docx
+++ b/docs/reports/2026-04-statschat-ke-testing-accuracy-report.docx
@@ -20,6 +20,14 @@
       </w:pPr>
       <w:r>
         <w:t>April 2026</w:t>
+      </w:r>
+    </w:p>
+    <w:p>
+      <w:pPr>
+        <w:spacing w:after="120"/>
+      </w:pPr>
+      <w:r>
+        <w:t>Author: Damian Ejlli</w:t>
       </w:r>
     </w:p>
     <w:p>

</xml_diff>